<commit_message>
Documento de Visión (ChatGPT y LegalAgent): pesos económicos según la rúbrica (desarrollo 20 %, mantenimiento 10 %)
Co-Authored-By: Claude Opus 5.5 <noreply@anthropic.com>
</commit_message>
<xml_diff>
--- a/NuestrosAvances/DocumentoDeVision/Documento de Visión - ChatGPT for Word.docx
+++ b/NuestrosAvances/DocumentoDeVision/Documento de Visión - ChatGPT for Word.docx
@@ -2559,7 +2559,7 @@
                 <w:szCs w:val="28"/>
                 <w:lang w:eastAsia="es-ES"/>
               </w:rPr>
-              <w:t>16%</w:t>
+              <w:t xml:space="preserve">16%</w:t>
             </w:r>
           </w:p>
         </w:tc>
@@ -2758,7 +2758,7 @@
                 <w:szCs w:val="28"/>
                 <w:lang w:eastAsia="es-ES"/>
               </w:rPr>
-              <w:t>20%</w:t>
+              <w:t xml:space="preserve">20%</w:t>
             </w:r>
           </w:p>
         </w:tc>
@@ -2972,7 +2972,7 @@
                 <w:szCs w:val="28"/>
                 <w:lang w:eastAsia="es-ES"/>
               </w:rPr>
-              <w:t>15%</w:t>
+              <w:t xml:space="preserve">15%</w:t>
             </w:r>
           </w:p>
         </w:tc>
@@ -3172,7 +3172,7 @@
                 <w:szCs w:val="28"/>
                 <w:lang w:eastAsia="es-ES"/>
               </w:rPr>
-              <w:t>15%</w:t>
+              <w:t xml:space="preserve">15%</w:t>
             </w:r>
           </w:p>
         </w:tc>
@@ -3258,7 +3258,7 @@
                 <w:szCs w:val="20"/>
                 <w:lang w:eastAsia="es-ES"/>
               </w:rPr>
-              <w:t>Costo Total de Desarrollo (10%)</w:t>
+              <w:t xml:space="preserve">Costo Total de Desarrollo (20%)</w:t>
             </w:r>
           </w:p>
         </w:tc>
@@ -3383,7 +3383,7 @@
                 <w:szCs w:val="28"/>
                 <w:lang w:eastAsia="es-ES"/>
               </w:rPr>
-              <w:t xml:space="preserve">8%</w:t>
+              <w:t xml:space="preserve">16%</w:t>
             </w:r>
           </w:p>
         </w:tc>
@@ -3454,7 +3454,7 @@
                 <w:szCs w:val="20"/>
                 <w:lang w:eastAsia="es-ES"/>
               </w:rPr>
-              <w:t>Costo Esperado del Mantenimiento (20%)</w:t>
+              <w:t xml:space="preserve">Costo Esperado del Mantenimiento (10%)</w:t>
             </w:r>
           </w:p>
         </w:tc>
@@ -3583,7 +3583,7 @@
                 <w:szCs w:val="28"/>
                 <w:lang w:eastAsia="es-ES"/>
               </w:rPr>
-              <w:t>20%</w:t>
+              <w:t xml:space="preserve">10%</w:t>
             </w:r>
           </w:p>
         </w:tc>
@@ -3721,7 +3721,7 @@
                 <w:szCs w:val="28"/>
                 <w:lang w:eastAsia="es-ES"/>
               </w:rPr>
-              <w:t xml:space="preserve">94%</w:t>
+              <w:t xml:space="preserve">92%</w:t>
             </w:r>
           </w:p>
         </w:tc>

</xml_diff>

<commit_message>
Documento de Visión (ChatGPT y LegalAgent): apéndices D (procesos de negocio) y E (usuarios del grupo piloto)
Co-Authored-By: Claude Opus 5.5 <noreply@anthropic.com>
</commit_message>
<xml_diff>
--- a/NuestrosAvances/DocumentoDeVision/Documento de Visión - ChatGPT for Word.docx
+++ b/NuestrosAvances/DocumentoDeVision/Documento de Visión - ChatGPT for Word.docx
@@ -10468,6 +10468,1951 @@
         </w:rPr>
       </w:pPr>
     </w:p>
+    <w:p>
+      <w:pPr>
+        <w:pageBreakBefore/>
+        <w:jc w:val="center"/>
+        <w:rPr>
+          <w:rFonts w:ascii="Libre Baskerville" w:hAnsi="Libre Baskerville" w:cs="Poppins"/>
+          <w:b/>
+          <w:sz w:val="28"/>
+          <w:szCs w:val="28"/>
+        </w:rPr>
+      </w:pPr>
+      <w:r>
+        <w:rPr>
+          <w:rFonts w:ascii="Libre Baskerville" w:hAnsi="Libre Baskerville" w:cs="Poppins"/>
+          <w:b/>
+          <w:sz w:val="28"/>
+          <w:szCs w:val="28"/>
+        </w:rPr>
+        <w:t xml:space="preserve">APÉNDICE D</w:t>
+      </w:r>
+    </w:p>
+    <w:p>
+      <w:pPr>
+        <w:jc w:val="center"/>
+        <w:rPr>
+          <w:rFonts w:ascii="Montserrat" w:hAnsi="Montserrat" w:cs="Poppins"/>
+          <w:b/>
+          <w:sz w:val="24"/>
+          <w:szCs w:val="24"/>
+        </w:rPr>
+      </w:pPr>
+      <w:r>
+        <w:rPr>
+          <w:rFonts w:ascii="Montserrat" w:hAnsi="Montserrat" w:cs="Poppins"/>
+          <w:b/>
+          <w:sz w:val="24"/>
+          <w:szCs w:val="24"/>
+        </w:rPr>
+        <w:t xml:space="preserve">DOCUMENTACIÓN DE LOS PROCESOS DE NEGOCIO A APOYAR</w:t>
+      </w:r>
+    </w:p>
+    <w:p>
+      <w:pPr>
+        <w:spacing w:before="240"/>
+        <w:jc w:val="both"/>
+        <w:rPr>
+          <w:rFonts w:ascii="Poppins" w:hAnsi="Poppins" w:cs="Poppins"/>
+          <w:sz w:val="24"/>
+          <w:szCs w:val="24"/>
+        </w:rPr>
+      </w:pPr>
+      <w:r>
+        <w:rPr>
+          <w:rFonts w:ascii="Poppins" w:hAnsi="Poppins" w:cs="Poppins"/>
+          <w:sz w:val="24"/>
+          <w:szCs w:val="24"/>
+        </w:rPr>
+        <w:t xml:space="preserve">Procesos actuales del estudiante de último año de Derecho que apoyará la solución, documentados a partir de la entrevista del 16/10/2026 [2]. Se describen como se realizan hoy, sin las aplicaciones propuestas, y se indica qué versión del flujo de valor los atiende.</w:t>
+      </w:r>
+    </w:p>
+    <w:p>
+      <w:pPr>
+        <w:spacing w:before="170"/>
+        <w:jc w:val="center"/>
+      </w:pPr>
+      <w:r>
+        <w:drawing>
+          <wp:inline xmlns:a="http://schemas.openxmlformats.org/drawingml/2006/main" xmlns:pic="http://schemas.openxmlformats.org/drawingml/2006/picture">
+            <wp:extent cx="5580000" cy="1611420"/>
+            <wp:docPr id="12" name="Picture 12"/>
+            <wp:cNvGraphicFramePr>
+              <a:graphicFrameLocks noChangeAspect="1"/>
+            </wp:cNvGraphicFramePr>
+            <a:graphic>
+              <a:graphicData uri="http://schemas.openxmlformats.org/drawingml/2006/picture">
+                <pic:pic>
+                  <pic:nvPicPr>
+                    <pic:cNvPr id="0" name="proc1.png"/>
+                    <pic:cNvPicPr/>
+                  </pic:nvPicPr>
+                  <pic:blipFill>
+                    <a:blip r:embed="rId26"/>
+                    <a:stretch>
+                      <a:fillRect/>
+                    </a:stretch>
+                  </pic:blipFill>
+                  <pic:spPr>
+                    <a:xfrm>
+                      <a:off x="0" y="0"/>
+                      <a:ext cx="5580000" cy="1611420"/>
+                    </a:xfrm>
+                    <a:prstGeom prst="rect"/>
+                  </pic:spPr>
+                </pic:pic>
+              </a:graphicData>
+            </a:graphic>
+          </wp:inline>
+        </w:drawing>
+      </w:r>
+    </w:p>
+    <w:tbl>
+      <w:tblPr>
+        <w:tblW w:w="8504" w:type="dxa"/>
+        <w:jc w:val="center"/>
+        <w:tblLayout w:type="fixed"/>
+      </w:tblPr>
+      <w:tblGrid>
+        <w:gridCol w:w="2300"/>
+        <w:gridCol w:w="6204"/>
+      </w:tblGrid>
+      <w:tr>
+        <w:trPr>
+          <w:cantSplit/>
+          <w:tblHeader/>
+        </w:trPr>
+        <w:tc>
+          <w:tcPr>
+            <w:tcW w:w="2300" w:type="dxa"/>
+            <w:tcBorders>
+              <w:top w:val="single" w:sz="4" w:space="0" w:color="000000"/>
+              <w:left w:val="single" w:sz="4" w:space="0" w:color="000000"/>
+              <w:bottom w:val="single" w:sz="4" w:space="0" w:color="000000"/>
+              <w:right w:val="single" w:sz="4" w:space="0" w:color="000000"/>
+            </w:tcBorders>
+            <w:shd w:val="clear" w:color="auto" w:fill="9900FF"/>
+            <w:tcMar>
+              <w:top w:w="30" w:type="dxa"/>
+              <w:left w:w="55" w:type="dxa"/>
+              <w:bottom w:w="30" w:type="dxa"/>
+              <w:right w:w="55" w:type="dxa"/>
+            </w:tcMar>
+            <w:vAlign w:val="center"/>
+          </w:tcPr>
+          <w:p>
+            <w:pPr>
+              <w:spacing w:before="0" w:after="0" w:line="240" w:lineRule="auto"/>
+              <w:jc w:val="center"/>
+            </w:pPr>
+            <w:r>
+              <w:rPr>
+                <w:rFonts w:ascii="Poppins" w:hAnsi="Poppins" w:cs="Poppins"/>
+                <w:b/>
+                <w:bCs/>
+                <w:color w:val="FFFFFF"/>
+                <w:sz w:val="17"/>
+                <w:szCs w:val="17"/>
+              </w:rPr>
+              <w:t xml:space="preserve">Elemento</w:t>
+            </w:r>
+          </w:p>
+        </w:tc>
+        <w:tc>
+          <w:tcPr>
+            <w:tcW w:w="6204" w:type="dxa"/>
+            <w:tcBorders>
+              <w:top w:val="single" w:sz="4" w:space="0" w:color="000000"/>
+              <w:left w:val="single" w:sz="4" w:space="0" w:color="000000"/>
+              <w:bottom w:val="single" w:sz="4" w:space="0" w:color="000000"/>
+              <w:right w:val="single" w:sz="4" w:space="0" w:color="000000"/>
+            </w:tcBorders>
+            <w:shd w:val="clear" w:color="auto" w:fill="9900FF"/>
+            <w:tcMar>
+              <w:top w:w="30" w:type="dxa"/>
+              <w:left w:w="55" w:type="dxa"/>
+              <w:bottom w:w="30" w:type="dxa"/>
+              <w:right w:w="55" w:type="dxa"/>
+            </w:tcMar>
+            <w:vAlign w:val="center"/>
+          </w:tcPr>
+          <w:p>
+            <w:pPr>
+              <w:spacing w:before="0" w:after="0" w:line="240" w:lineRule="auto"/>
+              <w:jc w:val="center"/>
+            </w:pPr>
+            <w:r>
+              <w:rPr>
+                <w:rFonts w:ascii="Poppins" w:hAnsi="Poppins" w:cs="Poppins"/>
+                <w:b/>
+                <w:bCs/>
+                <w:color w:val="FFFFFF"/>
+                <w:sz w:val="17"/>
+                <w:szCs w:val="17"/>
+              </w:rPr>
+              <w:t xml:space="preserve">Proceso 1: Coordinación de agendas y gestión de la pasantía</w:t>
+            </w:r>
+          </w:p>
+        </w:tc>
+      </w:tr>
+      <w:tr>
+        <w:trPr>
+          <w:cantSplit/>
+        </w:trPr>
+        <w:tc>
+          <w:tcPr>
+            <w:tcW w:w="2300" w:type="dxa"/>
+            <w:tcBorders>
+              <w:top w:val="single" w:sz="4" w:space="0" w:color="000000"/>
+              <w:left w:val="single" w:sz="4" w:space="0" w:color="000000"/>
+              <w:bottom w:val="single" w:sz="4" w:space="0" w:color="000000"/>
+              <w:right w:val="single" w:sz="4" w:space="0" w:color="000000"/>
+            </w:tcBorders>
+            <w:tcMar>
+              <w:top w:w="30" w:type="dxa"/>
+              <w:left w:w="55" w:type="dxa"/>
+              <w:bottom w:w="30" w:type="dxa"/>
+              <w:right w:w="55" w:type="dxa"/>
+            </w:tcMar>
+            <w:vAlign w:val="center"/>
+          </w:tcPr>
+          <w:p>
+            <w:pPr>
+              <w:spacing w:before="0" w:after="0" w:line="240" w:lineRule="auto"/>
+              <w:jc w:val="left"/>
+            </w:pPr>
+            <w:r>
+              <w:rPr>
+                <w:rFonts w:ascii="Poppins" w:hAnsi="Poppins" w:cs="Poppins"/>
+                <w:b/>
+                <w:bCs/>
+                <w:sz w:val="17"/>
+                <w:szCs w:val="17"/>
+              </w:rPr>
+              <w:t xml:space="preserve">Tipo de proceso</w:t>
+            </w:r>
+          </w:p>
+        </w:tc>
+        <w:tc>
+          <w:tcPr>
+            <w:tcW w:w="6204" w:type="dxa"/>
+            <w:tcBorders>
+              <w:top w:val="single" w:sz="4" w:space="0" w:color="000000"/>
+              <w:left w:val="single" w:sz="4" w:space="0" w:color="000000"/>
+              <w:bottom w:val="single" w:sz="4" w:space="0" w:color="000000"/>
+              <w:right w:val="single" w:sz="4" w:space="0" w:color="000000"/>
+            </w:tcBorders>
+            <w:tcMar>
+              <w:top w:w="30" w:type="dxa"/>
+              <w:left w:w="55" w:type="dxa"/>
+              <w:bottom w:w="30" w:type="dxa"/>
+              <w:right w:w="55" w:type="dxa"/>
+            </w:tcMar>
+            <w:vAlign w:val="center"/>
+          </w:tcPr>
+          <w:p>
+            <w:pPr>
+              <w:spacing w:before="0" w:after="0" w:line="240" w:lineRule="auto"/>
+              <w:jc w:val="left"/>
+            </w:pPr>
+            <w:r>
+              <w:rPr>
+                <w:rFonts w:ascii="Poppins" w:hAnsi="Poppins" w:cs="Poppins"/>
+                <w:sz w:val="17"/>
+                <w:szCs w:val="17"/>
+              </w:rPr>
+              <w:t xml:space="preserve">De apoyo (administrativo) para el estudiante.</w:t>
+            </w:r>
+          </w:p>
+        </w:tc>
+      </w:tr>
+      <w:tr>
+        <w:trPr>
+          <w:cantSplit/>
+        </w:trPr>
+        <w:tc>
+          <w:tcPr>
+            <w:tcW w:w="2300" w:type="dxa"/>
+            <w:tcBorders>
+              <w:top w:val="single" w:sz="4" w:space="0" w:color="000000"/>
+              <w:left w:val="single" w:sz="4" w:space="0" w:color="000000"/>
+              <w:bottom w:val="single" w:sz="4" w:space="0" w:color="000000"/>
+              <w:right w:val="single" w:sz="4" w:space="0" w:color="000000"/>
+            </w:tcBorders>
+            <w:tcMar>
+              <w:top w:w="30" w:type="dxa"/>
+              <w:left w:w="55" w:type="dxa"/>
+              <w:bottom w:w="30" w:type="dxa"/>
+              <w:right w:w="55" w:type="dxa"/>
+            </w:tcMar>
+            <w:vAlign w:val="center"/>
+          </w:tcPr>
+          <w:p>
+            <w:pPr>
+              <w:spacing w:before="0" w:after="0" w:line="240" w:lineRule="auto"/>
+              <w:jc w:val="left"/>
+            </w:pPr>
+            <w:r>
+              <w:rPr>
+                <w:rFonts w:ascii="Poppins" w:hAnsi="Poppins" w:cs="Poppins"/>
+                <w:b/>
+                <w:bCs/>
+                <w:sz w:val="17"/>
+                <w:szCs w:val="17"/>
+              </w:rPr>
+              <w:t xml:space="preserve">Actores</w:t>
+            </w:r>
+          </w:p>
+        </w:tc>
+        <w:tc>
+          <w:tcPr>
+            <w:tcW w:w="6204" w:type="dxa"/>
+            <w:tcBorders>
+              <w:top w:val="single" w:sz="4" w:space="0" w:color="000000"/>
+              <w:left w:val="single" w:sz="4" w:space="0" w:color="000000"/>
+              <w:bottom w:val="single" w:sz="4" w:space="0" w:color="000000"/>
+              <w:right w:val="single" w:sz="4" w:space="0" w:color="000000"/>
+            </w:tcBorders>
+            <w:tcMar>
+              <w:top w:w="30" w:type="dxa"/>
+              <w:left w:w="55" w:type="dxa"/>
+              <w:bottom w:w="30" w:type="dxa"/>
+              <w:right w:w="55" w:type="dxa"/>
+            </w:tcMar>
+            <w:vAlign w:val="center"/>
+          </w:tcPr>
+          <w:p>
+            <w:pPr>
+              <w:spacing w:before="0" w:after="0" w:line="240" w:lineRule="auto"/>
+              <w:jc w:val="left"/>
+            </w:pPr>
+            <w:r>
+              <w:rPr>
+                <w:rFonts w:ascii="Poppins" w:hAnsi="Poppins" w:cs="Poppins"/>
+                <w:sz w:val="17"/>
+                <w:szCs w:val="17"/>
+              </w:rPr>
+              <w:t xml:space="preserve">Estudiante, firma u organización empleadora, Parque Social (Clínica Jurídica) y la universidad.</w:t>
+            </w:r>
+          </w:p>
+        </w:tc>
+      </w:tr>
+      <w:tr>
+        <w:trPr>
+          <w:cantSplit/>
+        </w:trPr>
+        <w:tc>
+          <w:tcPr>
+            <w:tcW w:w="2300" w:type="dxa"/>
+            <w:tcBorders>
+              <w:top w:val="single" w:sz="4" w:space="0" w:color="000000"/>
+              <w:left w:val="single" w:sz="4" w:space="0" w:color="000000"/>
+              <w:bottom w:val="single" w:sz="4" w:space="0" w:color="000000"/>
+              <w:right w:val="single" w:sz="4" w:space="0" w:color="000000"/>
+            </w:tcBorders>
+            <w:tcMar>
+              <w:top w:w="30" w:type="dxa"/>
+              <w:left w:w="55" w:type="dxa"/>
+              <w:bottom w:w="30" w:type="dxa"/>
+              <w:right w:w="55" w:type="dxa"/>
+            </w:tcMar>
+            <w:vAlign w:val="center"/>
+          </w:tcPr>
+          <w:p>
+            <w:pPr>
+              <w:spacing w:before="0" w:after="0" w:line="240" w:lineRule="auto"/>
+              <w:jc w:val="left"/>
+            </w:pPr>
+            <w:r>
+              <w:rPr>
+                <w:rFonts w:ascii="Poppins" w:hAnsi="Poppins" w:cs="Poppins"/>
+                <w:b/>
+                <w:bCs/>
+                <w:sz w:val="17"/>
+                <w:szCs w:val="17"/>
+              </w:rPr>
+              <w:t xml:space="preserve">Entradas</w:t>
+            </w:r>
+          </w:p>
+        </w:tc>
+        <w:tc>
+          <w:tcPr>
+            <w:tcW w:w="6204" w:type="dxa"/>
+            <w:tcBorders>
+              <w:top w:val="single" w:sz="4" w:space="0" w:color="000000"/>
+              <w:left w:val="single" w:sz="4" w:space="0" w:color="000000"/>
+              <w:bottom w:val="single" w:sz="4" w:space="0" w:color="000000"/>
+              <w:right w:val="single" w:sz="4" w:space="0" w:color="000000"/>
+            </w:tcBorders>
+            <w:tcMar>
+              <w:top w:w="30" w:type="dxa"/>
+              <w:left w:w="55" w:type="dxa"/>
+              <w:bottom w:w="30" w:type="dxa"/>
+              <w:right w:w="55" w:type="dxa"/>
+            </w:tcMar>
+            <w:vAlign w:val="center"/>
+          </w:tcPr>
+          <w:p>
+            <w:pPr>
+              <w:spacing w:before="0" w:after="0" w:line="240" w:lineRule="auto"/>
+              <w:jc w:val="left"/>
+            </w:pPr>
+            <w:r>
+              <w:rPr>
+                <w:rFonts w:ascii="Poppins" w:hAnsi="Poppins" w:cs="Poppins"/>
+                <w:sz w:val="17"/>
+                <w:szCs w:val="17"/>
+              </w:rPr>
+              <w:t xml:space="preserve">Horario académico [8], ofertas de pasantía (redes personales, LinkedIn y grupos estudiantiles) [2] y requisitos de egreso de 240 horas [5].</w:t>
+            </w:r>
+          </w:p>
+        </w:tc>
+      </w:tr>
+      <w:tr>
+        <w:trPr>
+          <w:cantSplit/>
+        </w:trPr>
+        <w:tc>
+          <w:tcPr>
+            <w:tcW w:w="2300" w:type="dxa"/>
+            <w:tcBorders>
+              <w:top w:val="single" w:sz="4" w:space="0" w:color="000000"/>
+              <w:left w:val="single" w:sz="4" w:space="0" w:color="000000"/>
+              <w:bottom w:val="single" w:sz="4" w:space="0" w:color="000000"/>
+              <w:right w:val="single" w:sz="4" w:space="0" w:color="000000"/>
+            </w:tcBorders>
+            <w:tcMar>
+              <w:top w:w="30" w:type="dxa"/>
+              <w:left w:w="55" w:type="dxa"/>
+              <w:bottom w:w="30" w:type="dxa"/>
+              <w:right w:w="55" w:type="dxa"/>
+            </w:tcMar>
+            <w:vAlign w:val="center"/>
+          </w:tcPr>
+          <w:p>
+            <w:pPr>
+              <w:spacing w:before="0" w:after="0" w:line="240" w:lineRule="auto"/>
+              <w:jc w:val="left"/>
+            </w:pPr>
+            <w:r>
+              <w:rPr>
+                <w:rFonts w:ascii="Poppins" w:hAnsi="Poppins" w:cs="Poppins"/>
+                <w:b/>
+                <w:bCs/>
+                <w:sz w:val="17"/>
+                <w:szCs w:val="17"/>
+              </w:rPr>
+              <w:t xml:space="preserve">Salidas</w:t>
+            </w:r>
+          </w:p>
+        </w:tc>
+        <w:tc>
+          <w:tcPr>
+            <w:tcW w:w="6204" w:type="dxa"/>
+            <w:tcBorders>
+              <w:top w:val="single" w:sz="4" w:space="0" w:color="000000"/>
+              <w:left w:val="single" w:sz="4" w:space="0" w:color="000000"/>
+              <w:bottom w:val="single" w:sz="4" w:space="0" w:color="000000"/>
+              <w:right w:val="single" w:sz="4" w:space="0" w:color="000000"/>
+            </w:tcBorders>
+            <w:tcMar>
+              <w:top w:w="30" w:type="dxa"/>
+              <w:left w:w="55" w:type="dxa"/>
+              <w:bottom w:w="30" w:type="dxa"/>
+              <w:right w:w="55" w:type="dxa"/>
+            </w:tcMar>
+            <w:vAlign w:val="center"/>
+          </w:tcPr>
+          <w:p>
+            <w:pPr>
+              <w:spacing w:before="0" w:after="0" w:line="240" w:lineRule="auto"/>
+              <w:jc w:val="left"/>
+            </w:pPr>
+            <w:r>
+              <w:rPr>
+                <w:rFonts w:ascii="Poppins" w:hAnsi="Poppins" w:cs="Poppins"/>
+                <w:sz w:val="17"/>
+                <w:szCs w:val="17"/>
+              </w:rPr>
+              <w:t xml:space="preserve">Pasantía compatible con las clases, agenda coordinada y horas cumplidas registradas.</w:t>
+            </w:r>
+          </w:p>
+        </w:tc>
+      </w:tr>
+      <w:tr>
+        <w:trPr>
+          <w:cantSplit/>
+        </w:trPr>
+        <w:tc>
+          <w:tcPr>
+            <w:tcW w:w="2300" w:type="dxa"/>
+            <w:tcBorders>
+              <w:top w:val="single" w:sz="4" w:space="0" w:color="000000"/>
+              <w:left w:val="single" w:sz="4" w:space="0" w:color="000000"/>
+              <w:bottom w:val="single" w:sz="4" w:space="0" w:color="000000"/>
+              <w:right w:val="single" w:sz="4" w:space="0" w:color="000000"/>
+            </w:tcBorders>
+            <w:tcMar>
+              <w:top w:w="30" w:type="dxa"/>
+              <w:left w:w="55" w:type="dxa"/>
+              <w:bottom w:w="30" w:type="dxa"/>
+              <w:right w:w="55" w:type="dxa"/>
+            </w:tcMar>
+            <w:vAlign w:val="center"/>
+          </w:tcPr>
+          <w:p>
+            <w:pPr>
+              <w:spacing w:before="0" w:after="0" w:line="240" w:lineRule="auto"/>
+              <w:jc w:val="left"/>
+            </w:pPr>
+            <w:r>
+              <w:rPr>
+                <w:rFonts w:ascii="Poppins" w:hAnsi="Poppins" w:cs="Poppins"/>
+                <w:b/>
+                <w:bCs/>
+                <w:sz w:val="17"/>
+                <w:szCs w:val="17"/>
+              </w:rPr>
+              <w:t xml:space="preserve">Recursos de TI actuales</w:t>
+            </w:r>
+          </w:p>
+        </w:tc>
+        <w:tc>
+          <w:tcPr>
+            <w:tcW w:w="6204" w:type="dxa"/>
+            <w:tcBorders>
+              <w:top w:val="single" w:sz="4" w:space="0" w:color="000000"/>
+              <w:left w:val="single" w:sz="4" w:space="0" w:color="000000"/>
+              <w:bottom w:val="single" w:sz="4" w:space="0" w:color="000000"/>
+              <w:right w:val="single" w:sz="4" w:space="0" w:color="000000"/>
+            </w:tcBorders>
+            <w:tcMar>
+              <w:top w:w="30" w:type="dxa"/>
+              <w:left w:w="55" w:type="dxa"/>
+              <w:bottom w:w="30" w:type="dxa"/>
+              <w:right w:w="55" w:type="dxa"/>
+            </w:tcMar>
+            <w:vAlign w:val="center"/>
+          </w:tcPr>
+          <w:p>
+            <w:pPr>
+              <w:spacing w:before="0" w:after="0" w:line="240" w:lineRule="auto"/>
+              <w:jc w:val="left"/>
+            </w:pPr>
+            <w:r>
+              <w:rPr>
+                <w:rFonts w:ascii="Poppins" w:hAnsi="Poppins" w:cs="Poppins"/>
+                <w:sz w:val="17"/>
+                <w:szCs w:val="17"/>
+              </w:rPr>
+              <w:t xml:space="preserve">LinkedIn y mensajería de grupos estudiantiles [2].</w:t>
+            </w:r>
+          </w:p>
+        </w:tc>
+      </w:tr>
+      <w:tr>
+        <w:trPr>
+          <w:cantSplit/>
+        </w:trPr>
+        <w:tc>
+          <w:tcPr>
+            <w:tcW w:w="2300" w:type="dxa"/>
+            <w:tcBorders>
+              <w:top w:val="single" w:sz="4" w:space="0" w:color="000000"/>
+              <w:left w:val="single" w:sz="4" w:space="0" w:color="000000"/>
+              <w:bottom w:val="single" w:sz="4" w:space="0" w:color="000000"/>
+              <w:right w:val="single" w:sz="4" w:space="0" w:color="000000"/>
+            </w:tcBorders>
+            <w:tcMar>
+              <w:top w:w="30" w:type="dxa"/>
+              <w:left w:w="55" w:type="dxa"/>
+              <w:bottom w:w="30" w:type="dxa"/>
+              <w:right w:w="55" w:type="dxa"/>
+            </w:tcMar>
+            <w:vAlign w:val="center"/>
+          </w:tcPr>
+          <w:p>
+            <w:pPr>
+              <w:spacing w:before="0" w:after="0" w:line="240" w:lineRule="auto"/>
+              <w:jc w:val="left"/>
+            </w:pPr>
+            <w:r>
+              <w:rPr>
+                <w:rFonts w:ascii="Poppins" w:hAnsi="Poppins" w:cs="Poppins"/>
+                <w:b/>
+                <w:bCs/>
+                <w:sz w:val="17"/>
+                <w:szCs w:val="17"/>
+              </w:rPr>
+              <w:t xml:space="preserve">Problema detectado</w:t>
+            </w:r>
+          </w:p>
+        </w:tc>
+        <w:tc>
+          <w:tcPr>
+            <w:tcW w:w="6204" w:type="dxa"/>
+            <w:tcBorders>
+              <w:top w:val="single" w:sz="4" w:space="0" w:color="000000"/>
+              <w:left w:val="single" w:sz="4" w:space="0" w:color="000000"/>
+              <w:bottom w:val="single" w:sz="4" w:space="0" w:color="000000"/>
+              <w:right w:val="single" w:sz="4" w:space="0" w:color="000000"/>
+            </w:tcBorders>
+            <w:tcMar>
+              <w:top w:w="30" w:type="dxa"/>
+              <w:left w:w="55" w:type="dxa"/>
+              <w:bottom w:w="30" w:type="dxa"/>
+              <w:right w:w="55" w:type="dxa"/>
+            </w:tcMar>
+            <w:vAlign w:val="center"/>
+          </w:tcPr>
+          <w:p>
+            <w:pPr>
+              <w:spacing w:before="0" w:after="0" w:line="240" w:lineRule="auto"/>
+              <w:jc w:val="left"/>
+            </w:pPr>
+            <w:r>
+              <w:rPr>
+                <w:rFonts w:ascii="Poppins" w:hAnsi="Poppins" w:cs="Poppins"/>
+                <w:sz w:val="17"/>
+                <w:szCs w:val="17"/>
+              </w:rPr>
+              <w:t xml:space="preserve">Búsqueda informal por contactos y choque entre las agendas académica, de oficina y de calle [2].</w:t>
+            </w:r>
+          </w:p>
+        </w:tc>
+      </w:tr>
+      <w:tr>
+        <w:trPr>
+          <w:cantSplit/>
+        </w:trPr>
+        <w:tc>
+          <w:tcPr>
+            <w:tcW w:w="2300" w:type="dxa"/>
+            <w:tcBorders>
+              <w:top w:val="single" w:sz="4" w:space="0" w:color="000000"/>
+              <w:left w:val="single" w:sz="4" w:space="0" w:color="000000"/>
+              <w:bottom w:val="single" w:sz="4" w:space="0" w:color="000000"/>
+              <w:right w:val="single" w:sz="4" w:space="0" w:color="000000"/>
+            </w:tcBorders>
+            <w:tcMar>
+              <w:top w:w="30" w:type="dxa"/>
+              <w:left w:w="55" w:type="dxa"/>
+              <w:bottom w:w="30" w:type="dxa"/>
+              <w:right w:w="55" w:type="dxa"/>
+            </w:tcMar>
+            <w:vAlign w:val="center"/>
+          </w:tcPr>
+          <w:p>
+            <w:pPr>
+              <w:spacing w:before="0" w:after="0" w:line="240" w:lineRule="auto"/>
+              <w:jc w:val="left"/>
+            </w:pPr>
+            <w:r>
+              <w:rPr>
+                <w:rFonts w:ascii="Poppins" w:hAnsi="Poppins" w:cs="Poppins"/>
+                <w:b/>
+                <w:bCs/>
+                <w:sz w:val="17"/>
+                <w:szCs w:val="17"/>
+              </w:rPr>
+              <w:t xml:space="preserve">Aplicación que lo apoya</w:t>
+            </w:r>
+          </w:p>
+        </w:tc>
+        <w:tc>
+          <w:tcPr>
+            <w:tcW w:w="6204" w:type="dxa"/>
+            <w:tcBorders>
+              <w:top w:val="single" w:sz="4" w:space="0" w:color="000000"/>
+              <w:left w:val="single" w:sz="4" w:space="0" w:color="000000"/>
+              <w:bottom w:val="single" w:sz="4" w:space="0" w:color="000000"/>
+              <w:right w:val="single" w:sz="4" w:space="0" w:color="000000"/>
+            </w:tcBorders>
+            <w:tcMar>
+              <w:top w:w="30" w:type="dxa"/>
+              <w:left w:w="55" w:type="dxa"/>
+              <w:bottom w:w="30" w:type="dxa"/>
+              <w:right w:w="55" w:type="dxa"/>
+            </w:tcMar>
+            <w:vAlign w:val="center"/>
+          </w:tcPr>
+          <w:p>
+            <w:pPr>
+              <w:spacing w:before="0" w:after="0" w:line="240" w:lineRule="auto"/>
+              <w:jc w:val="left"/>
+            </w:pPr>
+            <w:r>
+              <w:rPr>
+                <w:rFonts w:ascii="Poppins" w:hAnsi="Poppins" w:cs="Poppins"/>
+                <w:sz w:val="17"/>
+                <w:szCs w:val="17"/>
+              </w:rPr>
+              <w:t xml:space="preserve">LinkedIn Jobs (Versión 1 del Marco de Trabajo).</w:t>
+            </w:r>
+          </w:p>
+        </w:tc>
+      </w:tr>
+    </w:tbl>
+    <w:p>
+      <w:pPr>
+        <w:spacing w:before="170"/>
+        <w:jc w:val="center"/>
+      </w:pPr>
+      <w:r>
+        <w:drawing>
+          <wp:inline xmlns:a="http://schemas.openxmlformats.org/drawingml/2006/main" xmlns:pic="http://schemas.openxmlformats.org/drawingml/2006/picture">
+            <wp:extent cx="5580000" cy="1611420"/>
+            <wp:docPr id="12" name="Picture 12"/>
+            <wp:cNvGraphicFramePr>
+              <a:graphicFrameLocks noChangeAspect="1"/>
+            </wp:cNvGraphicFramePr>
+            <a:graphic>
+              <a:graphicData uri="http://schemas.openxmlformats.org/drawingml/2006/picture">
+                <pic:pic>
+                  <pic:nvPicPr>
+                    <pic:cNvPr id="0" name="proc2.png"/>
+                    <pic:cNvPicPr/>
+                  </pic:nvPicPr>
+                  <pic:blipFill>
+                    <a:blip r:embed="rId27"/>
+                    <a:stretch>
+                      <a:fillRect/>
+                    </a:stretch>
+                  </pic:blipFill>
+                  <pic:spPr>
+                    <a:xfrm>
+                      <a:off x="0" y="0"/>
+                      <a:ext cx="5580000" cy="1611420"/>
+                    </a:xfrm>
+                    <a:prstGeom prst="rect"/>
+                  </pic:spPr>
+                </pic:pic>
+              </a:graphicData>
+            </a:graphic>
+          </wp:inline>
+        </w:drawing>
+      </w:r>
+    </w:p>
+    <w:tbl>
+      <w:tblPr>
+        <w:tblW w:w="8504" w:type="dxa"/>
+        <w:jc w:val="center"/>
+        <w:tblLayout w:type="fixed"/>
+      </w:tblPr>
+      <w:tblGrid>
+        <w:gridCol w:w="2300"/>
+        <w:gridCol w:w="6204"/>
+      </w:tblGrid>
+      <w:tr>
+        <w:trPr>
+          <w:cantSplit/>
+          <w:tblHeader/>
+        </w:trPr>
+        <w:tc>
+          <w:tcPr>
+            <w:tcW w:w="2300" w:type="dxa"/>
+            <w:tcBorders>
+              <w:top w:val="single" w:sz="4" w:space="0" w:color="000000"/>
+              <w:left w:val="single" w:sz="4" w:space="0" w:color="000000"/>
+              <w:bottom w:val="single" w:sz="4" w:space="0" w:color="000000"/>
+              <w:right w:val="single" w:sz="4" w:space="0" w:color="000000"/>
+            </w:tcBorders>
+            <w:shd w:val="clear" w:color="auto" w:fill="9900FF"/>
+            <w:tcMar>
+              <w:top w:w="30" w:type="dxa"/>
+              <w:left w:w="55" w:type="dxa"/>
+              <w:bottom w:w="30" w:type="dxa"/>
+              <w:right w:w="55" w:type="dxa"/>
+            </w:tcMar>
+            <w:vAlign w:val="center"/>
+          </w:tcPr>
+          <w:p>
+            <w:pPr>
+              <w:spacing w:before="0" w:after="0" w:line="240" w:lineRule="auto"/>
+              <w:jc w:val="center"/>
+            </w:pPr>
+            <w:r>
+              <w:rPr>
+                <w:rFonts w:ascii="Poppins" w:hAnsi="Poppins" w:cs="Poppins"/>
+                <w:b/>
+                <w:bCs/>
+                <w:color w:val="FFFFFF"/>
+                <w:sz w:val="17"/>
+                <w:szCs w:val="17"/>
+              </w:rPr>
+              <w:t xml:space="preserve">Elemento</w:t>
+            </w:r>
+          </w:p>
+        </w:tc>
+        <w:tc>
+          <w:tcPr>
+            <w:tcW w:w="6204" w:type="dxa"/>
+            <w:tcBorders>
+              <w:top w:val="single" w:sz="4" w:space="0" w:color="000000"/>
+              <w:left w:val="single" w:sz="4" w:space="0" w:color="000000"/>
+              <w:bottom w:val="single" w:sz="4" w:space="0" w:color="000000"/>
+              <w:right w:val="single" w:sz="4" w:space="0" w:color="000000"/>
+            </w:tcBorders>
+            <w:shd w:val="clear" w:color="auto" w:fill="9900FF"/>
+            <w:tcMar>
+              <w:top w:w="30" w:type="dxa"/>
+              <w:left w:w="55" w:type="dxa"/>
+              <w:bottom w:w="30" w:type="dxa"/>
+              <w:right w:w="55" w:type="dxa"/>
+            </w:tcMar>
+            <w:vAlign w:val="center"/>
+          </w:tcPr>
+          <w:p>
+            <w:pPr>
+              <w:spacing w:before="0" w:after="0" w:line="240" w:lineRule="auto"/>
+              <w:jc w:val="center"/>
+            </w:pPr>
+            <w:r>
+              <w:rPr>
+                <w:rFonts w:ascii="Poppins" w:hAnsi="Poppins" w:cs="Poppins"/>
+                <w:b/>
+                <w:bCs/>
+                <w:color w:val="FFFFFF"/>
+                <w:sz w:val="17"/>
+                <w:szCs w:val="17"/>
+              </w:rPr>
+              <w:t xml:space="preserve">Proceso 2: Redacción de contratos durante la pasantía</w:t>
+            </w:r>
+          </w:p>
+        </w:tc>
+      </w:tr>
+      <w:tr>
+        <w:trPr>
+          <w:cantSplit/>
+        </w:trPr>
+        <w:tc>
+          <w:tcPr>
+            <w:tcW w:w="2300" w:type="dxa"/>
+            <w:tcBorders>
+              <w:top w:val="single" w:sz="4" w:space="0" w:color="000000"/>
+              <w:left w:val="single" w:sz="4" w:space="0" w:color="000000"/>
+              <w:bottom w:val="single" w:sz="4" w:space="0" w:color="000000"/>
+              <w:right w:val="single" w:sz="4" w:space="0" w:color="000000"/>
+            </w:tcBorders>
+            <w:tcMar>
+              <w:top w:w="30" w:type="dxa"/>
+              <w:left w:w="55" w:type="dxa"/>
+              <w:bottom w:w="30" w:type="dxa"/>
+              <w:right w:w="55" w:type="dxa"/>
+            </w:tcMar>
+            <w:vAlign w:val="center"/>
+          </w:tcPr>
+          <w:p>
+            <w:pPr>
+              <w:spacing w:before="0" w:after="0" w:line="240" w:lineRule="auto"/>
+              <w:jc w:val="left"/>
+            </w:pPr>
+            <w:r>
+              <w:rPr>
+                <w:rFonts w:ascii="Poppins" w:hAnsi="Poppins" w:cs="Poppins"/>
+                <w:b/>
+                <w:bCs/>
+                <w:sz w:val="17"/>
+                <w:szCs w:val="17"/>
+              </w:rPr>
+              <w:t xml:space="preserve">Tipo de proceso</w:t>
+            </w:r>
+          </w:p>
+        </w:tc>
+        <w:tc>
+          <w:tcPr>
+            <w:tcW w:w="6204" w:type="dxa"/>
+            <w:tcBorders>
+              <w:top w:val="single" w:sz="4" w:space="0" w:color="000000"/>
+              <w:left w:val="single" w:sz="4" w:space="0" w:color="000000"/>
+              <w:bottom w:val="single" w:sz="4" w:space="0" w:color="000000"/>
+              <w:right w:val="single" w:sz="4" w:space="0" w:color="000000"/>
+            </w:tcBorders>
+            <w:tcMar>
+              <w:top w:w="30" w:type="dxa"/>
+              <w:left w:w="55" w:type="dxa"/>
+              <w:bottom w:w="30" w:type="dxa"/>
+              <w:right w:w="55" w:type="dxa"/>
+            </w:tcMar>
+            <w:vAlign w:val="center"/>
+          </w:tcPr>
+          <w:p>
+            <w:pPr>
+              <w:spacing w:before="0" w:after="0" w:line="240" w:lineRule="auto"/>
+              <w:jc w:val="left"/>
+            </w:pPr>
+            <w:r>
+              <w:rPr>
+                <w:rFonts w:ascii="Poppins" w:hAnsi="Poppins" w:cs="Poppins"/>
+                <w:sz w:val="17"/>
+                <w:szCs w:val="17"/>
+              </w:rPr>
+              <w:t xml:space="preserve">Primario: es la labor jurídica central del pasante de oficina.</w:t>
+            </w:r>
+          </w:p>
+        </w:tc>
+      </w:tr>
+      <w:tr>
+        <w:trPr>
+          <w:cantSplit/>
+        </w:trPr>
+        <w:tc>
+          <w:tcPr>
+            <w:tcW w:w="2300" w:type="dxa"/>
+            <w:tcBorders>
+              <w:top w:val="single" w:sz="4" w:space="0" w:color="000000"/>
+              <w:left w:val="single" w:sz="4" w:space="0" w:color="000000"/>
+              <w:bottom w:val="single" w:sz="4" w:space="0" w:color="000000"/>
+              <w:right w:val="single" w:sz="4" w:space="0" w:color="000000"/>
+            </w:tcBorders>
+            <w:tcMar>
+              <w:top w:w="30" w:type="dxa"/>
+              <w:left w:w="55" w:type="dxa"/>
+              <w:bottom w:w="30" w:type="dxa"/>
+              <w:right w:w="55" w:type="dxa"/>
+            </w:tcMar>
+            <w:vAlign w:val="center"/>
+          </w:tcPr>
+          <w:p>
+            <w:pPr>
+              <w:spacing w:before="0" w:after="0" w:line="240" w:lineRule="auto"/>
+              <w:jc w:val="left"/>
+            </w:pPr>
+            <w:r>
+              <w:rPr>
+                <w:rFonts w:ascii="Poppins" w:hAnsi="Poppins" w:cs="Poppins"/>
+                <w:b/>
+                <w:bCs/>
+                <w:sz w:val="17"/>
+                <w:szCs w:val="17"/>
+              </w:rPr>
+              <w:t xml:space="preserve">Actores</w:t>
+            </w:r>
+          </w:p>
+        </w:tc>
+        <w:tc>
+          <w:tcPr>
+            <w:tcW w:w="6204" w:type="dxa"/>
+            <w:tcBorders>
+              <w:top w:val="single" w:sz="4" w:space="0" w:color="000000"/>
+              <w:left w:val="single" w:sz="4" w:space="0" w:color="000000"/>
+              <w:bottom w:val="single" w:sz="4" w:space="0" w:color="000000"/>
+              <w:right w:val="single" w:sz="4" w:space="0" w:color="000000"/>
+            </w:tcBorders>
+            <w:tcMar>
+              <w:top w:w="30" w:type="dxa"/>
+              <w:left w:w="55" w:type="dxa"/>
+              <w:bottom w:w="30" w:type="dxa"/>
+              <w:right w:w="55" w:type="dxa"/>
+            </w:tcMar>
+            <w:vAlign w:val="center"/>
+          </w:tcPr>
+          <w:p>
+            <w:pPr>
+              <w:spacing w:before="0" w:after="0" w:line="240" w:lineRule="auto"/>
+              <w:jc w:val="left"/>
+            </w:pPr>
+            <w:r>
+              <w:rPr>
+                <w:rFonts w:ascii="Poppins" w:hAnsi="Poppins" w:cs="Poppins"/>
+                <w:sz w:val="17"/>
+                <w:szCs w:val="17"/>
+              </w:rPr>
+              <w:t xml:space="preserve">Pasante, abogado supervisor y cliente de la firma.</w:t>
+            </w:r>
+          </w:p>
+        </w:tc>
+      </w:tr>
+      <w:tr>
+        <w:trPr>
+          <w:cantSplit/>
+        </w:trPr>
+        <w:tc>
+          <w:tcPr>
+            <w:tcW w:w="2300" w:type="dxa"/>
+            <w:tcBorders>
+              <w:top w:val="single" w:sz="4" w:space="0" w:color="000000"/>
+              <w:left w:val="single" w:sz="4" w:space="0" w:color="000000"/>
+              <w:bottom w:val="single" w:sz="4" w:space="0" w:color="000000"/>
+              <w:right w:val="single" w:sz="4" w:space="0" w:color="000000"/>
+            </w:tcBorders>
+            <w:tcMar>
+              <w:top w:w="30" w:type="dxa"/>
+              <w:left w:w="55" w:type="dxa"/>
+              <w:bottom w:w="30" w:type="dxa"/>
+              <w:right w:w="55" w:type="dxa"/>
+            </w:tcMar>
+            <w:vAlign w:val="center"/>
+          </w:tcPr>
+          <w:p>
+            <w:pPr>
+              <w:spacing w:before="0" w:after="0" w:line="240" w:lineRule="auto"/>
+              <w:jc w:val="left"/>
+            </w:pPr>
+            <w:r>
+              <w:rPr>
+                <w:rFonts w:ascii="Poppins" w:hAnsi="Poppins" w:cs="Poppins"/>
+                <w:b/>
+                <w:bCs/>
+                <w:sz w:val="17"/>
+                <w:szCs w:val="17"/>
+              </w:rPr>
+              <w:t xml:space="preserve">Entradas</w:t>
+            </w:r>
+          </w:p>
+        </w:tc>
+        <w:tc>
+          <w:tcPr>
+            <w:tcW w:w="6204" w:type="dxa"/>
+            <w:tcBorders>
+              <w:top w:val="single" w:sz="4" w:space="0" w:color="000000"/>
+              <w:left w:val="single" w:sz="4" w:space="0" w:color="000000"/>
+              <w:bottom w:val="single" w:sz="4" w:space="0" w:color="000000"/>
+              <w:right w:val="single" w:sz="4" w:space="0" w:color="000000"/>
+            </w:tcBorders>
+            <w:tcMar>
+              <w:top w:w="30" w:type="dxa"/>
+              <w:left w:w="55" w:type="dxa"/>
+              <w:bottom w:w="30" w:type="dxa"/>
+              <w:right w:w="55" w:type="dxa"/>
+            </w:tcMar>
+            <w:vAlign w:val="center"/>
+          </w:tcPr>
+          <w:p>
+            <w:pPr>
+              <w:spacing w:before="0" w:after="0" w:line="240" w:lineRule="auto"/>
+              <w:jc w:val="left"/>
+            </w:pPr>
+            <w:r>
+              <w:rPr>
+                <w:rFonts w:ascii="Poppins" w:hAnsi="Poppins" w:cs="Poppins"/>
+                <w:sz w:val="17"/>
+                <w:szCs w:val="17"/>
+              </w:rPr>
+              <w:t xml:space="preserve">Instrucción del supervisor, hechos del caso, modelos y contratos previos.</w:t>
+            </w:r>
+          </w:p>
+        </w:tc>
+      </w:tr>
+      <w:tr>
+        <w:trPr>
+          <w:cantSplit/>
+        </w:trPr>
+        <w:tc>
+          <w:tcPr>
+            <w:tcW w:w="2300" w:type="dxa"/>
+            <w:tcBorders>
+              <w:top w:val="single" w:sz="4" w:space="0" w:color="000000"/>
+              <w:left w:val="single" w:sz="4" w:space="0" w:color="000000"/>
+              <w:bottom w:val="single" w:sz="4" w:space="0" w:color="000000"/>
+              <w:right w:val="single" w:sz="4" w:space="0" w:color="000000"/>
+            </w:tcBorders>
+            <w:tcMar>
+              <w:top w:w="30" w:type="dxa"/>
+              <w:left w:w="55" w:type="dxa"/>
+              <w:bottom w:w="30" w:type="dxa"/>
+              <w:right w:w="55" w:type="dxa"/>
+            </w:tcMar>
+            <w:vAlign w:val="center"/>
+          </w:tcPr>
+          <w:p>
+            <w:pPr>
+              <w:spacing w:before="0" w:after="0" w:line="240" w:lineRule="auto"/>
+              <w:jc w:val="left"/>
+            </w:pPr>
+            <w:r>
+              <w:rPr>
+                <w:rFonts w:ascii="Poppins" w:hAnsi="Poppins" w:cs="Poppins"/>
+                <w:b/>
+                <w:bCs/>
+                <w:sz w:val="17"/>
+                <w:szCs w:val="17"/>
+              </w:rPr>
+              <w:t xml:space="preserve">Salidas</w:t>
+            </w:r>
+          </w:p>
+        </w:tc>
+        <w:tc>
+          <w:tcPr>
+            <w:tcW w:w="6204" w:type="dxa"/>
+            <w:tcBorders>
+              <w:top w:val="single" w:sz="4" w:space="0" w:color="000000"/>
+              <w:left w:val="single" w:sz="4" w:space="0" w:color="000000"/>
+              <w:bottom w:val="single" w:sz="4" w:space="0" w:color="000000"/>
+              <w:right w:val="single" w:sz="4" w:space="0" w:color="000000"/>
+            </w:tcBorders>
+            <w:tcMar>
+              <w:top w:w="30" w:type="dxa"/>
+              <w:left w:w="55" w:type="dxa"/>
+              <w:bottom w:w="30" w:type="dxa"/>
+              <w:right w:w="55" w:type="dxa"/>
+            </w:tcMar>
+            <w:vAlign w:val="center"/>
+          </w:tcPr>
+          <w:p>
+            <w:pPr>
+              <w:spacing w:before="0" w:after="0" w:line="240" w:lineRule="auto"/>
+              <w:jc w:val="left"/>
+            </w:pPr>
+            <w:r>
+              <w:rPr>
+                <w:rFonts w:ascii="Poppins" w:hAnsi="Poppins" w:cs="Poppins"/>
+                <w:sz w:val="17"/>
+                <w:szCs w:val="17"/>
+              </w:rPr>
+              <w:t xml:space="preserve">Contrato revisado, firmado y archivado.</w:t>
+            </w:r>
+          </w:p>
+        </w:tc>
+      </w:tr>
+      <w:tr>
+        <w:trPr>
+          <w:cantSplit/>
+        </w:trPr>
+        <w:tc>
+          <w:tcPr>
+            <w:tcW w:w="2300" w:type="dxa"/>
+            <w:tcBorders>
+              <w:top w:val="single" w:sz="4" w:space="0" w:color="000000"/>
+              <w:left w:val="single" w:sz="4" w:space="0" w:color="000000"/>
+              <w:bottom w:val="single" w:sz="4" w:space="0" w:color="000000"/>
+              <w:right w:val="single" w:sz="4" w:space="0" w:color="000000"/>
+            </w:tcBorders>
+            <w:tcMar>
+              <w:top w:w="30" w:type="dxa"/>
+              <w:left w:w="55" w:type="dxa"/>
+              <w:bottom w:w="30" w:type="dxa"/>
+              <w:right w:w="55" w:type="dxa"/>
+            </w:tcMar>
+            <w:vAlign w:val="center"/>
+          </w:tcPr>
+          <w:p>
+            <w:pPr>
+              <w:spacing w:before="0" w:after="0" w:line="240" w:lineRule="auto"/>
+              <w:jc w:val="left"/>
+            </w:pPr>
+            <w:r>
+              <w:rPr>
+                <w:rFonts w:ascii="Poppins" w:hAnsi="Poppins" w:cs="Poppins"/>
+                <w:b/>
+                <w:bCs/>
+                <w:sz w:val="17"/>
+                <w:szCs w:val="17"/>
+              </w:rPr>
+              <w:t xml:space="preserve">Recursos de TI actuales</w:t>
+            </w:r>
+          </w:p>
+        </w:tc>
+        <w:tc>
+          <w:tcPr>
+            <w:tcW w:w="6204" w:type="dxa"/>
+            <w:tcBorders>
+              <w:top w:val="single" w:sz="4" w:space="0" w:color="000000"/>
+              <w:left w:val="single" w:sz="4" w:space="0" w:color="000000"/>
+              <w:bottom w:val="single" w:sz="4" w:space="0" w:color="000000"/>
+              <w:right w:val="single" w:sz="4" w:space="0" w:color="000000"/>
+            </w:tcBorders>
+            <w:tcMar>
+              <w:top w:w="30" w:type="dxa"/>
+              <w:left w:w="55" w:type="dxa"/>
+              <w:bottom w:w="30" w:type="dxa"/>
+              <w:right w:w="55" w:type="dxa"/>
+            </w:tcMar>
+            <w:vAlign w:val="center"/>
+          </w:tcPr>
+          <w:p>
+            <w:pPr>
+              <w:spacing w:before="0" w:after="0" w:line="240" w:lineRule="auto"/>
+              <w:jc w:val="left"/>
+            </w:pPr>
+            <w:r>
+              <w:rPr>
+                <w:rFonts w:ascii="Poppins" w:hAnsi="Poppins" w:cs="Poppins"/>
+                <w:sz w:val="17"/>
+                <w:szCs w:val="17"/>
+              </w:rPr>
+              <w:t xml:space="preserve">Microsoft Word, Microjuris (consulta de leyes y jurisprudencia), Adobe Sign (firma) y SAP Ariba (gestión de contratos en entornos corporativos) [2].</w:t>
+            </w:r>
+          </w:p>
+        </w:tc>
+      </w:tr>
+      <w:tr>
+        <w:trPr>
+          <w:cantSplit/>
+        </w:trPr>
+        <w:tc>
+          <w:tcPr>
+            <w:tcW w:w="2300" w:type="dxa"/>
+            <w:tcBorders>
+              <w:top w:val="single" w:sz="4" w:space="0" w:color="000000"/>
+              <w:left w:val="single" w:sz="4" w:space="0" w:color="000000"/>
+              <w:bottom w:val="single" w:sz="4" w:space="0" w:color="000000"/>
+              <w:right w:val="single" w:sz="4" w:space="0" w:color="000000"/>
+            </w:tcBorders>
+            <w:tcMar>
+              <w:top w:w="30" w:type="dxa"/>
+              <w:left w:w="55" w:type="dxa"/>
+              <w:bottom w:w="30" w:type="dxa"/>
+              <w:right w:w="55" w:type="dxa"/>
+            </w:tcMar>
+            <w:vAlign w:val="center"/>
+          </w:tcPr>
+          <w:p>
+            <w:pPr>
+              <w:spacing w:before="0" w:after="0" w:line="240" w:lineRule="auto"/>
+              <w:jc w:val="left"/>
+            </w:pPr>
+            <w:r>
+              <w:rPr>
+                <w:rFonts w:ascii="Poppins" w:hAnsi="Poppins" w:cs="Poppins"/>
+                <w:b/>
+                <w:bCs/>
+                <w:sz w:val="17"/>
+                <w:szCs w:val="17"/>
+              </w:rPr>
+              <w:t xml:space="preserve">Problema detectado</w:t>
+            </w:r>
+          </w:p>
+        </w:tc>
+        <w:tc>
+          <w:tcPr>
+            <w:tcW w:w="6204" w:type="dxa"/>
+            <w:tcBorders>
+              <w:top w:val="single" w:sz="4" w:space="0" w:color="000000"/>
+              <w:left w:val="single" w:sz="4" w:space="0" w:color="000000"/>
+              <w:bottom w:val="single" w:sz="4" w:space="0" w:color="000000"/>
+              <w:right w:val="single" w:sz="4" w:space="0" w:color="000000"/>
+            </w:tcBorders>
+            <w:tcMar>
+              <w:top w:w="30" w:type="dxa"/>
+              <w:left w:w="55" w:type="dxa"/>
+              <w:bottom w:w="30" w:type="dxa"/>
+              <w:right w:w="55" w:type="dxa"/>
+            </w:tcMar>
+            <w:vAlign w:val="center"/>
+          </w:tcPr>
+          <w:p>
+            <w:pPr>
+              <w:spacing w:before="0" w:after="0" w:line="240" w:lineRule="auto"/>
+              <w:jc w:val="left"/>
+            </w:pPr>
+            <w:r>
+              <w:rPr>
+                <w:rFonts w:ascii="Poppins" w:hAnsi="Poppins" w:cs="Poppins"/>
+                <w:sz w:val="17"/>
+                <w:szCs w:val="17"/>
+              </w:rPr>
+              <w:t xml:space="preserve">El borrador se arma a mano como un «rompecabezas» de cláusulas estandarizadas, una tarea repetitiva [2].</w:t>
+            </w:r>
+          </w:p>
+        </w:tc>
+      </w:tr>
+      <w:tr>
+        <w:trPr>
+          <w:cantSplit/>
+        </w:trPr>
+        <w:tc>
+          <w:tcPr>
+            <w:tcW w:w="2300" w:type="dxa"/>
+            <w:tcBorders>
+              <w:top w:val="single" w:sz="4" w:space="0" w:color="000000"/>
+              <w:left w:val="single" w:sz="4" w:space="0" w:color="000000"/>
+              <w:bottom w:val="single" w:sz="4" w:space="0" w:color="000000"/>
+              <w:right w:val="single" w:sz="4" w:space="0" w:color="000000"/>
+            </w:tcBorders>
+            <w:tcMar>
+              <w:top w:w="30" w:type="dxa"/>
+              <w:left w:w="55" w:type="dxa"/>
+              <w:bottom w:w="30" w:type="dxa"/>
+              <w:right w:w="55" w:type="dxa"/>
+            </w:tcMar>
+            <w:vAlign w:val="center"/>
+          </w:tcPr>
+          <w:p>
+            <w:pPr>
+              <w:spacing w:before="0" w:after="0" w:line="240" w:lineRule="auto"/>
+              <w:jc w:val="left"/>
+            </w:pPr>
+            <w:r>
+              <w:rPr>
+                <w:rFonts w:ascii="Poppins" w:hAnsi="Poppins" w:cs="Poppins"/>
+                <w:b/>
+                <w:bCs/>
+                <w:sz w:val="17"/>
+                <w:szCs w:val="17"/>
+              </w:rPr>
+              <w:t xml:space="preserve">Aplicación que lo apoya</w:t>
+            </w:r>
+          </w:p>
+        </w:tc>
+        <w:tc>
+          <w:tcPr>
+            <w:tcW w:w="6204" w:type="dxa"/>
+            <w:tcBorders>
+              <w:top w:val="single" w:sz="4" w:space="0" w:color="000000"/>
+              <w:left w:val="single" w:sz="4" w:space="0" w:color="000000"/>
+              <w:bottom w:val="single" w:sz="4" w:space="0" w:color="000000"/>
+              <w:right w:val="single" w:sz="4" w:space="0" w:color="000000"/>
+            </w:tcBorders>
+            <w:tcMar>
+              <w:top w:w="30" w:type="dxa"/>
+              <w:left w:w="55" w:type="dxa"/>
+              <w:bottom w:w="30" w:type="dxa"/>
+              <w:right w:w="55" w:type="dxa"/>
+            </w:tcMar>
+            <w:vAlign w:val="center"/>
+          </w:tcPr>
+          <w:p>
+            <w:pPr>
+              <w:spacing w:before="0" w:after="0" w:line="240" w:lineRule="auto"/>
+              <w:jc w:val="left"/>
+            </w:pPr>
+            <w:r>
+              <w:rPr>
+                <w:rFonts w:ascii="Poppins" w:hAnsi="Poppins" w:cs="Poppins"/>
+                <w:sz w:val="17"/>
+                <w:szCs w:val="17"/>
+              </w:rPr>
+              <w:t xml:space="preserve">ChatGPT for Word (Versión 2 del Marco de Trabajo), con la validación final del abogado supervisor.</w:t>
+            </w:r>
+          </w:p>
+        </w:tc>
+      </w:tr>
+    </w:tbl>
+    <w:p>
+      <w:pPr>
+        <w:pageBreakBefore/>
+        <w:jc w:val="center"/>
+        <w:rPr>
+          <w:rFonts w:ascii="Libre Baskerville" w:hAnsi="Libre Baskerville" w:cs="Poppins"/>
+          <w:b/>
+          <w:sz w:val="28"/>
+          <w:szCs w:val="28"/>
+        </w:rPr>
+      </w:pPr>
+      <w:r>
+        <w:rPr>
+          <w:rFonts w:ascii="Libre Baskerville" w:hAnsi="Libre Baskerville" w:cs="Poppins"/>
+          <w:b/>
+          <w:sz w:val="28"/>
+          <w:szCs w:val="28"/>
+        </w:rPr>
+        <w:t xml:space="preserve">APÉNDICE E</w:t>
+      </w:r>
+    </w:p>
+    <w:p>
+      <w:pPr>
+        <w:jc w:val="center"/>
+        <w:rPr>
+          <w:rFonts w:ascii="Montserrat" w:hAnsi="Montserrat" w:cs="Poppins"/>
+          <w:b/>
+          <w:sz w:val="24"/>
+          <w:szCs w:val="24"/>
+        </w:rPr>
+      </w:pPr>
+      <w:r>
+        <w:rPr>
+          <w:rFonts w:ascii="Montserrat" w:hAnsi="Montserrat" w:cs="Poppins"/>
+          <w:b/>
+          <w:sz w:val="24"/>
+          <w:szCs w:val="24"/>
+        </w:rPr>
+        <w:t xml:space="preserve">USUARIOS POTENCIALES DEL GRUPO PILOTO</w:t>
+      </w:r>
+    </w:p>
+    <w:p>
+      <w:pPr>
+        <w:spacing w:before="240"/>
+        <w:jc w:val="both"/>
+        <w:rPr>
+          <w:rFonts w:ascii="Poppins" w:hAnsi="Poppins" w:cs="Poppins"/>
+          <w:sz w:val="24"/>
+          <w:szCs w:val="24"/>
+        </w:rPr>
+      </w:pPr>
+      <w:r>
+        <w:rPr>
+          <w:rFonts w:ascii="Poppins" w:hAnsi="Poppins" w:cs="Poppins"/>
+          <w:sz w:val="24"/>
+          <w:szCs w:val="24"/>
+        </w:rPr>
+        <w:t xml:space="preserve">Personas reales que participaron en la validación de la oportunidad y que integrarán el grupo piloto de usuarios de la solución.</w:t>
+      </w:r>
+    </w:p>
+    <w:tbl>
+      <w:tblPr>
+        <w:tblW w:w="8504" w:type="dxa"/>
+        <w:jc w:val="center"/>
+        <w:tblLayout w:type="fixed"/>
+      </w:tblPr>
+      <w:tblGrid>
+        <w:gridCol w:w="1500"/>
+        <w:gridCol w:w="1850"/>
+        <w:gridCol w:w="2354"/>
+        <w:gridCol w:w="1300"/>
+        <w:gridCol w:w="1500"/>
+      </w:tblGrid>
+      <w:tr>
+        <w:trPr>
+          <w:cantSplit/>
+          <w:tblHeader/>
+        </w:trPr>
+        <w:tc>
+          <w:tcPr>
+            <w:tcW w:w="1500" w:type="dxa"/>
+            <w:tcBorders>
+              <w:top w:val="single" w:sz="4" w:space="0" w:color="000000"/>
+              <w:left w:val="single" w:sz="4" w:space="0" w:color="000000"/>
+              <w:bottom w:val="single" w:sz="4" w:space="0" w:color="000000"/>
+              <w:right w:val="single" w:sz="4" w:space="0" w:color="000000"/>
+            </w:tcBorders>
+            <w:shd w:val="clear" w:color="auto" w:fill="9900FF"/>
+            <w:tcMar>
+              <w:top w:w="30" w:type="dxa"/>
+              <w:left w:w="55" w:type="dxa"/>
+              <w:bottom w:w="30" w:type="dxa"/>
+              <w:right w:w="55" w:type="dxa"/>
+            </w:tcMar>
+            <w:vAlign w:val="center"/>
+          </w:tcPr>
+          <w:p>
+            <w:pPr>
+              <w:spacing w:before="0" w:after="0" w:line="240" w:lineRule="auto"/>
+              <w:jc w:val="center"/>
+            </w:pPr>
+            <w:r>
+              <w:rPr>
+                <w:rFonts w:ascii="Poppins" w:hAnsi="Poppins" w:cs="Poppins"/>
+                <w:b/>
+                <w:bCs/>
+                <w:color w:val="FFFFFF"/>
+                <w:sz w:val="17"/>
+                <w:szCs w:val="17"/>
+              </w:rPr>
+              <w:t xml:space="preserve">Nombre</w:t>
+            </w:r>
+          </w:p>
+        </w:tc>
+        <w:tc>
+          <w:tcPr>
+            <w:tcW w:w="1850" w:type="dxa"/>
+            <w:tcBorders>
+              <w:top w:val="single" w:sz="4" w:space="0" w:color="000000"/>
+              <w:left w:val="single" w:sz="4" w:space="0" w:color="000000"/>
+              <w:bottom w:val="single" w:sz="4" w:space="0" w:color="000000"/>
+              <w:right w:val="single" w:sz="4" w:space="0" w:color="000000"/>
+            </w:tcBorders>
+            <w:shd w:val="clear" w:color="auto" w:fill="9900FF"/>
+            <w:tcMar>
+              <w:top w:w="30" w:type="dxa"/>
+              <w:left w:w="55" w:type="dxa"/>
+              <w:bottom w:w="30" w:type="dxa"/>
+              <w:right w:w="55" w:type="dxa"/>
+            </w:tcMar>
+            <w:vAlign w:val="center"/>
+          </w:tcPr>
+          <w:p>
+            <w:pPr>
+              <w:spacing w:before="0" w:after="0" w:line="240" w:lineRule="auto"/>
+              <w:jc w:val="center"/>
+            </w:pPr>
+            <w:r>
+              <w:rPr>
+                <w:rFonts w:ascii="Poppins" w:hAnsi="Poppins" w:cs="Poppins"/>
+                <w:b/>
+                <w:bCs/>
+                <w:color w:val="FFFFFF"/>
+                <w:sz w:val="17"/>
+                <w:szCs w:val="17"/>
+              </w:rPr>
+              <w:t xml:space="preserve">Rol y organización</w:t>
+            </w:r>
+          </w:p>
+        </w:tc>
+        <w:tc>
+          <w:tcPr>
+            <w:tcW w:w="2354" w:type="dxa"/>
+            <w:tcBorders>
+              <w:top w:val="single" w:sz="4" w:space="0" w:color="000000"/>
+              <w:left w:val="single" w:sz="4" w:space="0" w:color="000000"/>
+              <w:bottom w:val="single" w:sz="4" w:space="0" w:color="000000"/>
+              <w:right w:val="single" w:sz="4" w:space="0" w:color="000000"/>
+            </w:tcBorders>
+            <w:shd w:val="clear" w:color="auto" w:fill="9900FF"/>
+            <w:tcMar>
+              <w:top w:w="30" w:type="dxa"/>
+              <w:left w:w="55" w:type="dxa"/>
+              <w:bottom w:w="30" w:type="dxa"/>
+              <w:right w:w="55" w:type="dxa"/>
+            </w:tcMar>
+            <w:vAlign w:val="center"/>
+          </w:tcPr>
+          <w:p>
+            <w:pPr>
+              <w:spacing w:before="0" w:after="0" w:line="240" w:lineRule="auto"/>
+              <w:jc w:val="center"/>
+            </w:pPr>
+            <w:r>
+              <w:rPr>
+                <w:rFonts w:ascii="Poppins" w:hAnsi="Poppins" w:cs="Poppins"/>
+                <w:b/>
+                <w:bCs/>
+                <w:color w:val="FFFFFF"/>
+                <w:sz w:val="17"/>
+                <w:szCs w:val="17"/>
+              </w:rPr>
+              <w:t xml:space="preserve">Perfil y aporte</w:t>
+            </w:r>
+          </w:p>
+        </w:tc>
+        <w:tc>
+          <w:tcPr>
+            <w:tcW w:w="1300" w:type="dxa"/>
+            <w:tcBorders>
+              <w:top w:val="single" w:sz="4" w:space="0" w:color="000000"/>
+              <w:left w:val="single" w:sz="4" w:space="0" w:color="000000"/>
+              <w:bottom w:val="single" w:sz="4" w:space="0" w:color="000000"/>
+              <w:right w:val="single" w:sz="4" w:space="0" w:color="000000"/>
+            </w:tcBorders>
+            <w:shd w:val="clear" w:color="auto" w:fill="9900FF"/>
+            <w:tcMar>
+              <w:top w:w="30" w:type="dxa"/>
+              <w:left w:w="55" w:type="dxa"/>
+              <w:bottom w:w="30" w:type="dxa"/>
+              <w:right w:w="55" w:type="dxa"/>
+            </w:tcMar>
+            <w:vAlign w:val="center"/>
+          </w:tcPr>
+          <w:p>
+            <w:pPr>
+              <w:spacing w:before="0" w:after="0" w:line="240" w:lineRule="auto"/>
+              <w:jc w:val="center"/>
+            </w:pPr>
+            <w:r>
+              <w:rPr>
+                <w:rFonts w:ascii="Poppins" w:hAnsi="Poppins" w:cs="Poppins"/>
+                <w:b/>
+                <w:bCs/>
+                <w:color w:val="FFFFFF"/>
+                <w:sz w:val="17"/>
+                <w:szCs w:val="17"/>
+              </w:rPr>
+              <w:t xml:space="preserve">Contacto</w:t>
+            </w:r>
+          </w:p>
+        </w:tc>
+        <w:tc>
+          <w:tcPr>
+            <w:tcW w:w="1500" w:type="dxa"/>
+            <w:tcBorders>
+              <w:top w:val="single" w:sz="4" w:space="0" w:color="000000"/>
+              <w:left w:val="single" w:sz="4" w:space="0" w:color="000000"/>
+              <w:bottom w:val="single" w:sz="4" w:space="0" w:color="000000"/>
+              <w:right w:val="single" w:sz="4" w:space="0" w:color="000000"/>
+            </w:tcBorders>
+            <w:shd w:val="clear" w:color="auto" w:fill="9900FF"/>
+            <w:tcMar>
+              <w:top w:w="30" w:type="dxa"/>
+              <w:left w:w="55" w:type="dxa"/>
+              <w:bottom w:w="30" w:type="dxa"/>
+              <w:right w:w="55" w:type="dxa"/>
+            </w:tcMar>
+            <w:vAlign w:val="center"/>
+          </w:tcPr>
+          <w:p>
+            <w:pPr>
+              <w:spacing w:before="0" w:after="0" w:line="240" w:lineRule="auto"/>
+              <w:jc w:val="center"/>
+            </w:pPr>
+            <w:r>
+              <w:rPr>
+                <w:rFonts w:ascii="Poppins" w:hAnsi="Poppins" w:cs="Poppins"/>
+                <w:b/>
+                <w:bCs/>
+                <w:color w:val="FFFFFF"/>
+                <w:sz w:val="17"/>
+                <w:szCs w:val="17"/>
+              </w:rPr>
+              <w:t xml:space="preserve">Participación</w:t>
+            </w:r>
+          </w:p>
+        </w:tc>
+      </w:tr>
+      <w:tr>
+        <w:trPr>
+          <w:cantSplit/>
+        </w:trPr>
+        <w:tc>
+          <w:tcPr>
+            <w:tcW w:w="1500" w:type="dxa"/>
+            <w:tcBorders>
+              <w:top w:val="single" w:sz="4" w:space="0" w:color="000000"/>
+              <w:left w:val="single" w:sz="4" w:space="0" w:color="000000"/>
+              <w:bottom w:val="single" w:sz="4" w:space="0" w:color="000000"/>
+              <w:right w:val="single" w:sz="4" w:space="0" w:color="000000"/>
+            </w:tcBorders>
+            <w:tcMar>
+              <w:top w:w="30" w:type="dxa"/>
+              <w:left w:w="55" w:type="dxa"/>
+              <w:bottom w:w="30" w:type="dxa"/>
+              <w:right w:w="55" w:type="dxa"/>
+            </w:tcMar>
+            <w:vAlign w:val="center"/>
+          </w:tcPr>
+          <w:p>
+            <w:pPr>
+              <w:spacing w:before="0" w:after="0" w:line="240" w:lineRule="auto"/>
+              <w:jc w:val="left"/>
+            </w:pPr>
+            <w:r>
+              <w:rPr>
+                <w:rFonts w:ascii="Poppins" w:hAnsi="Poppins" w:cs="Poppins"/>
+                <w:sz w:val="17"/>
+                <w:szCs w:val="17"/>
+              </w:rPr>
+              <w:t xml:space="preserve">Santiago Ángel</w:t>
+            </w:r>
+          </w:p>
+        </w:tc>
+        <w:tc>
+          <w:tcPr>
+            <w:tcW w:w="1850" w:type="dxa"/>
+            <w:tcBorders>
+              <w:top w:val="single" w:sz="4" w:space="0" w:color="000000"/>
+              <w:left w:val="single" w:sz="4" w:space="0" w:color="000000"/>
+              <w:bottom w:val="single" w:sz="4" w:space="0" w:color="000000"/>
+              <w:right w:val="single" w:sz="4" w:space="0" w:color="000000"/>
+            </w:tcBorders>
+            <w:tcMar>
+              <w:top w:w="30" w:type="dxa"/>
+              <w:left w:w="55" w:type="dxa"/>
+              <w:bottom w:w="30" w:type="dxa"/>
+              <w:right w:w="55" w:type="dxa"/>
+            </w:tcMar>
+            <w:vAlign w:val="center"/>
+          </w:tcPr>
+          <w:p>
+            <w:pPr>
+              <w:spacing w:before="0" w:after="0" w:line="240" w:lineRule="auto"/>
+              <w:jc w:val="left"/>
+            </w:pPr>
+            <w:r>
+              <w:rPr>
+                <w:rFonts w:ascii="Poppins" w:hAnsi="Poppins" w:cs="Poppins"/>
+                <w:sz w:val="17"/>
+                <w:szCs w:val="17"/>
+              </w:rPr>
+              <w:t xml:space="preserve">Estudiante de último año de Derecho, UCAB</w:t>
+            </w:r>
+          </w:p>
+        </w:tc>
+        <w:tc>
+          <w:tcPr>
+            <w:tcW w:w="2354" w:type="dxa"/>
+            <w:tcBorders>
+              <w:top w:val="single" w:sz="4" w:space="0" w:color="000000"/>
+              <w:left w:val="single" w:sz="4" w:space="0" w:color="000000"/>
+              <w:bottom w:val="single" w:sz="4" w:space="0" w:color="000000"/>
+              <w:right w:val="single" w:sz="4" w:space="0" w:color="000000"/>
+            </w:tcBorders>
+            <w:tcMar>
+              <w:top w:w="30" w:type="dxa"/>
+              <w:left w:w="55" w:type="dxa"/>
+              <w:bottom w:w="30" w:type="dxa"/>
+              <w:right w:w="55" w:type="dxa"/>
+            </w:tcMar>
+            <w:vAlign w:val="center"/>
+          </w:tcPr>
+          <w:p>
+            <w:pPr>
+              <w:spacing w:before="0" w:after="0" w:line="240" w:lineRule="auto"/>
+              <w:jc w:val="left"/>
+            </w:pPr>
+            <w:r>
+              <w:rPr>
+                <w:rFonts w:ascii="Poppins" w:hAnsi="Poppins" w:cs="Poppins"/>
+                <w:sz w:val="17"/>
+                <w:szCs w:val="17"/>
+              </w:rPr>
+              <w:t xml:space="preserve">Entrevistado el 16/10/2026 [2]; conoce la búsqueda de pasantías y el trabajo de calle.</w:t>
+            </w:r>
+          </w:p>
+        </w:tc>
+        <w:tc>
+          <w:tcPr>
+            <w:tcW w:w="1300" w:type="dxa"/>
+            <w:tcBorders>
+              <w:top w:val="single" w:sz="4" w:space="0" w:color="000000"/>
+              <w:left w:val="single" w:sz="4" w:space="0" w:color="000000"/>
+              <w:bottom w:val="single" w:sz="4" w:space="0" w:color="000000"/>
+              <w:right w:val="single" w:sz="4" w:space="0" w:color="000000"/>
+            </w:tcBorders>
+            <w:shd w:val="clear" w:color="auto" w:fill="FFFF00"/>
+            <w:tcMar>
+              <w:top w:w="30" w:type="dxa"/>
+              <w:left w:w="55" w:type="dxa"/>
+              <w:bottom w:w="30" w:type="dxa"/>
+              <w:right w:w="55" w:type="dxa"/>
+            </w:tcMar>
+            <w:vAlign w:val="center"/>
+          </w:tcPr>
+          <w:p>
+            <w:pPr>
+              <w:spacing w:before="0" w:after="0" w:line="240" w:lineRule="auto"/>
+              <w:jc w:val="center"/>
+            </w:pPr>
+            <w:r>
+              <w:rPr>
+                <w:rFonts w:ascii="Poppins" w:hAnsi="Poppins" w:cs="Poppins"/>
+                <w:sz w:val="17"/>
+                <w:szCs w:val="17"/>
+              </w:rPr>
+              <w:t xml:space="preserve">[correo o teléfono]</w:t>
+            </w:r>
+          </w:p>
+        </w:tc>
+        <w:tc>
+          <w:tcPr>
+            <w:tcW w:w="1500" w:type="dxa"/>
+            <w:tcBorders>
+              <w:top w:val="single" w:sz="4" w:space="0" w:color="000000"/>
+              <w:left w:val="single" w:sz="4" w:space="0" w:color="000000"/>
+              <w:bottom w:val="single" w:sz="4" w:space="0" w:color="000000"/>
+              <w:right w:val="single" w:sz="4" w:space="0" w:color="000000"/>
+            </w:tcBorders>
+            <w:shd w:val="clear" w:color="auto" w:fill="FFFF00"/>
+            <w:tcMar>
+              <w:top w:w="30" w:type="dxa"/>
+              <w:left w:w="55" w:type="dxa"/>
+              <w:bottom w:w="30" w:type="dxa"/>
+              <w:right w:w="55" w:type="dxa"/>
+            </w:tcMar>
+            <w:vAlign w:val="center"/>
+          </w:tcPr>
+          <w:p>
+            <w:pPr>
+              <w:spacing w:before="0" w:after="0" w:line="240" w:lineRule="auto"/>
+              <w:jc w:val="center"/>
+            </w:pPr>
+            <w:r>
+              <w:rPr>
+                <w:rFonts w:ascii="Poppins" w:hAnsi="Poppins" w:cs="Poppins"/>
+                <w:sz w:val="17"/>
+                <w:szCs w:val="17"/>
+              </w:rPr>
+              <w:t xml:space="preserve">[confirmar]</w:t>
+            </w:r>
+          </w:p>
+        </w:tc>
+      </w:tr>
+      <w:tr>
+        <w:trPr>
+          <w:cantSplit/>
+        </w:trPr>
+        <w:tc>
+          <w:tcPr>
+            <w:tcW w:w="1500" w:type="dxa"/>
+            <w:tcBorders>
+              <w:top w:val="single" w:sz="4" w:space="0" w:color="000000"/>
+              <w:left w:val="single" w:sz="4" w:space="0" w:color="000000"/>
+              <w:bottom w:val="single" w:sz="4" w:space="0" w:color="000000"/>
+              <w:right w:val="single" w:sz="4" w:space="0" w:color="000000"/>
+            </w:tcBorders>
+            <w:tcMar>
+              <w:top w:w="30" w:type="dxa"/>
+              <w:left w:w="55" w:type="dxa"/>
+              <w:bottom w:w="30" w:type="dxa"/>
+              <w:right w:w="55" w:type="dxa"/>
+            </w:tcMar>
+            <w:vAlign w:val="center"/>
+          </w:tcPr>
+          <w:p>
+            <w:pPr>
+              <w:spacing w:before="0" w:after="0" w:line="240" w:lineRule="auto"/>
+              <w:jc w:val="left"/>
+            </w:pPr>
+            <w:r>
+              <w:rPr>
+                <w:rFonts w:ascii="Poppins" w:hAnsi="Poppins" w:cs="Poppins"/>
+                <w:sz w:val="17"/>
+                <w:szCs w:val="17"/>
+              </w:rPr>
+              <w:t xml:space="preserve">David Palacios</w:t>
+            </w:r>
+          </w:p>
+        </w:tc>
+        <w:tc>
+          <w:tcPr>
+            <w:tcW w:w="1850" w:type="dxa"/>
+            <w:tcBorders>
+              <w:top w:val="single" w:sz="4" w:space="0" w:color="000000"/>
+              <w:left w:val="single" w:sz="4" w:space="0" w:color="000000"/>
+              <w:bottom w:val="single" w:sz="4" w:space="0" w:color="000000"/>
+              <w:right w:val="single" w:sz="4" w:space="0" w:color="000000"/>
+            </w:tcBorders>
+            <w:tcMar>
+              <w:top w:w="30" w:type="dxa"/>
+              <w:left w:w="55" w:type="dxa"/>
+              <w:bottom w:w="30" w:type="dxa"/>
+              <w:right w:w="55" w:type="dxa"/>
+            </w:tcMar>
+            <w:vAlign w:val="center"/>
+          </w:tcPr>
+          <w:p>
+            <w:pPr>
+              <w:spacing w:before="0" w:after="0" w:line="240" w:lineRule="auto"/>
+              <w:jc w:val="left"/>
+            </w:pPr>
+            <w:r>
+              <w:rPr>
+                <w:rFonts w:ascii="Poppins" w:hAnsi="Poppins" w:cs="Poppins"/>
+                <w:sz w:val="17"/>
+                <w:szCs w:val="17"/>
+              </w:rPr>
+              <w:t xml:space="preserve">Estudiante de último año de Derecho, UCAB</w:t>
+            </w:r>
+          </w:p>
+        </w:tc>
+        <w:tc>
+          <w:tcPr>
+            <w:tcW w:w="2354" w:type="dxa"/>
+            <w:tcBorders>
+              <w:top w:val="single" w:sz="4" w:space="0" w:color="000000"/>
+              <w:left w:val="single" w:sz="4" w:space="0" w:color="000000"/>
+              <w:bottom w:val="single" w:sz="4" w:space="0" w:color="000000"/>
+              <w:right w:val="single" w:sz="4" w:space="0" w:color="000000"/>
+            </w:tcBorders>
+            <w:tcMar>
+              <w:top w:w="30" w:type="dxa"/>
+              <w:left w:w="55" w:type="dxa"/>
+              <w:bottom w:w="30" w:type="dxa"/>
+              <w:right w:w="55" w:type="dxa"/>
+            </w:tcMar>
+            <w:vAlign w:val="center"/>
+          </w:tcPr>
+          <w:p>
+            <w:pPr>
+              <w:spacing w:before="0" w:after="0" w:line="240" w:lineRule="auto"/>
+              <w:jc w:val="left"/>
+            </w:pPr>
+            <w:r>
+              <w:rPr>
+                <w:rFonts w:ascii="Poppins" w:hAnsi="Poppins" w:cs="Poppins"/>
+                <w:sz w:val="17"/>
+                <w:szCs w:val="17"/>
+              </w:rPr>
+              <w:t xml:space="preserve">Entrevistado el 16/10/2026 [2]; experiencia en pasantías y redacción de contratos.</w:t>
+            </w:r>
+          </w:p>
+        </w:tc>
+        <w:tc>
+          <w:tcPr>
+            <w:tcW w:w="1300" w:type="dxa"/>
+            <w:tcBorders>
+              <w:top w:val="single" w:sz="4" w:space="0" w:color="000000"/>
+              <w:left w:val="single" w:sz="4" w:space="0" w:color="000000"/>
+              <w:bottom w:val="single" w:sz="4" w:space="0" w:color="000000"/>
+              <w:right w:val="single" w:sz="4" w:space="0" w:color="000000"/>
+            </w:tcBorders>
+            <w:shd w:val="clear" w:color="auto" w:fill="FFFF00"/>
+            <w:tcMar>
+              <w:top w:w="30" w:type="dxa"/>
+              <w:left w:w="55" w:type="dxa"/>
+              <w:bottom w:w="30" w:type="dxa"/>
+              <w:right w:w="55" w:type="dxa"/>
+            </w:tcMar>
+            <w:vAlign w:val="center"/>
+          </w:tcPr>
+          <w:p>
+            <w:pPr>
+              <w:spacing w:before="0" w:after="0" w:line="240" w:lineRule="auto"/>
+              <w:jc w:val="center"/>
+            </w:pPr>
+            <w:r>
+              <w:rPr>
+                <w:rFonts w:ascii="Poppins" w:hAnsi="Poppins" w:cs="Poppins"/>
+                <w:sz w:val="17"/>
+                <w:szCs w:val="17"/>
+              </w:rPr>
+              <w:t xml:space="preserve">[correo o teléfono]</w:t>
+            </w:r>
+          </w:p>
+        </w:tc>
+        <w:tc>
+          <w:tcPr>
+            <w:tcW w:w="1500" w:type="dxa"/>
+            <w:tcBorders>
+              <w:top w:val="single" w:sz="4" w:space="0" w:color="000000"/>
+              <w:left w:val="single" w:sz="4" w:space="0" w:color="000000"/>
+              <w:bottom w:val="single" w:sz="4" w:space="0" w:color="000000"/>
+              <w:right w:val="single" w:sz="4" w:space="0" w:color="000000"/>
+            </w:tcBorders>
+            <w:shd w:val="clear" w:color="auto" w:fill="FFFF00"/>
+            <w:tcMar>
+              <w:top w:w="30" w:type="dxa"/>
+              <w:left w:w="55" w:type="dxa"/>
+              <w:bottom w:w="30" w:type="dxa"/>
+              <w:right w:w="55" w:type="dxa"/>
+            </w:tcMar>
+            <w:vAlign w:val="center"/>
+          </w:tcPr>
+          <w:p>
+            <w:pPr>
+              <w:spacing w:before="0" w:after="0" w:line="240" w:lineRule="auto"/>
+              <w:jc w:val="center"/>
+            </w:pPr>
+            <w:r>
+              <w:rPr>
+                <w:rFonts w:ascii="Poppins" w:hAnsi="Poppins" w:cs="Poppins"/>
+                <w:sz w:val="17"/>
+                <w:szCs w:val="17"/>
+              </w:rPr>
+              <w:t xml:space="preserve">[confirmar]</w:t>
+            </w:r>
+          </w:p>
+        </w:tc>
+      </w:tr>
+      <w:tr>
+        <w:trPr>
+          <w:cantSplit/>
+        </w:trPr>
+        <w:tc>
+          <w:tcPr>
+            <w:tcW w:w="8504" w:type="dxa"/>
+            <w:gridSpan w:val="5"/>
+            <w:tcBorders>
+              <w:top w:val="single" w:sz="4" w:space="0" w:color="000000"/>
+              <w:left w:val="single" w:sz="4" w:space="0" w:color="000000"/>
+              <w:bottom w:val="single" w:sz="4" w:space="0" w:color="000000"/>
+              <w:right w:val="single" w:sz="4" w:space="0" w:color="000000"/>
+            </w:tcBorders>
+            <w:shd w:val="clear" w:color="auto" w:fill="FFFF00"/>
+            <w:tcMar>
+              <w:top w:w="30" w:type="dxa"/>
+              <w:left w:w="55" w:type="dxa"/>
+              <w:bottom w:w="30" w:type="dxa"/>
+              <w:right w:w="55" w:type="dxa"/>
+            </w:tcMar>
+            <w:vAlign w:val="center"/>
+          </w:tcPr>
+          <w:p>
+            <w:pPr>
+              <w:spacing w:before="0" w:after="0" w:line="240" w:lineRule="auto"/>
+              <w:jc w:val="left"/>
+            </w:pPr>
+            <w:r>
+              <w:rPr>
+                <w:rFonts w:ascii="Poppins" w:hAnsi="Poppins" w:cs="Poppins"/>
+                <w:sz w:val="17"/>
+                <w:szCs w:val="17"/>
+              </w:rPr>
+              <w:t xml:space="preserve">[Agregar usuarios adicionales: estudiante en firma de abogados, en la Clínica Jurídica de Parque Social o en un departamento legal in-house]</w:t>
+            </w:r>
+          </w:p>
+        </w:tc>
+      </w:tr>
+    </w:tbl>
     <w:p>
       <w:pPr>
         <w:pageBreakBefore/>

</xml_diff>